<commit_message>
Rework payment default: no verified control = no enhanced-tier payment
Replaces the ambiguous "annual advance no-change update" with two
explicit tracks: (1) default hold on the enhanced-staffing payment
until a control is completed and confirmed, removing the retroactive
clawback timing problem entirely, and (2) a narrower roll-over rule
limited to daycares with an already-finalized, unchallenged status
from a prior cycle. Updates the responsibility table and open items
accordingly.

Co-Authored-By: Claude Sonnet 5 <noreply@anthropic.com>
Claude-Session: https://claude.ai/code/session_01V6t6Pf2ZsUBKwJQvagKkc3
</commit_message>
<xml_diff>
--- a/daycare-shared-procedure/נוהל_עבודה_משותף_מעונות_יום.docx
+++ b/daycare-shared-procedure/נוהל_עבודה_משותף_מעונות_יום.docx
@@ -461,7 +461,7 @@
           <w:u w:val="single"/>
           <w:rtl/>
         </w:rPr>
-        <w:t xml:space="preserve">3.3 עדכון שנתי מראש במקרה של היעדר שינוי</w:t>
+        <w:t xml:space="preserve">3.3 ברירת מחדל: היעדר בקרה מאומתת = היעדר תשלום ברכיב המוגדל</w:t>
       </w:r>
     </w:p>
     <w:p>
@@ -481,26 +481,7 @@
           <w:szCs w:val="22"/>
           <w:rtl/>
         </w:rPr>
-        <w:t xml:space="preserve">לגבי מעונות שלגביהם לא נמצא שינוי בבקרה (התקינה בפועל תואמת את הדיווח הקיים), יעביר משרד החינוך למשרד העבודה מראש, לפני תחילת כל שנת תקציב, הצהרה מרוכזת כי אין שינוי הנדרש, כך שהתשלום השוטף יימשך כסדרו וללא צורך באישור פרטני חוזר לכל מעון.</w:t>
-      </w:r>
-    </w:p>
-    <w:p>
-      <w:pPr>
-        <w:bidi/>
-        <w:spacing w:after="100" w:before="160"/>
-        <w:jc w:val="right"/>
-      </w:pPr>
-      <w:r>
-        <w:rPr>
-          <w:rFonts w:ascii="David" w:cs="David" w:eastAsia="David" w:hAnsi="David"/>
-          <w:b/>
-          <w:bCs/>
-          <w:sz w:val="22"/>
-          <w:szCs w:val="22"/>
-          <w:u w:val="single"/>
-          <w:rtl/>
-        </w:rPr>
-        <w:t xml:space="preserve">3.4 תשומות והיערכות מוקדמת של משרד העבודה</w:t>
+        <w:t xml:space="preserve">ככלל, מעון לא יקבל הכרה ותשלום בגין הרכיב המוגדל (מעבר לתקינה הבסיסית) אלא אם קיימת לגביו בקרה תקפה שהושלמה ואושרה - בין אם בקרה שהושלמה במחזור הנוכחי, ובין אם בקרה "מגולגלת" ומוכרת ממחזור קודם כמפורט בסעיף 3.4 להלן.</w:t>
       </w:r>
     </w:p>
     <w:p>
@@ -520,7 +501,27 @@
           <w:szCs w:val="22"/>
           <w:rtl/>
         </w:rPr>
-        <w:t xml:space="preserve">משרד החינוך יביא בחשבון את צורכי ההיערכות של משרד העבודה כגוף המשלם, ויפעל להעברת הנתונים והתשומות הנדרשות בפרק זמן שיאפשר למשרד העבודה לבצע את ההתאמות התקציביות בזמן, כך שלא יישאר תקציב "באוויר" ללא החלטה עד תום שנת התקציב.</w:t>
+        <w:t xml:space="preserve">ככל שלא בוצעה ולא הושלמה בקרה למעון עד למועד הקובע שייקבע מול משרד העבודה (ר' נושא פתוח מס' 2 בסעיף 5), התשלום ברכיב המוגדל עבור אותו מעון יעוכב עד להשלמת הבקרה וההליך הנלווה לה (לרבות שימוע, ככל שנדרש) - ולא ישולם מראש על מנת להיות מקוזז בדיעבד.</w:t>
+      </w:r>
+    </w:p>
+    <w:p>
+      <w:pPr>
+        <w:bidi/>
+        <w:spacing w:after="160" w:line="300"/>
+        <w:jc w:val="right"/>
+      </w:pPr>
+      <w:r>
+        <w:rPr>
+          <w:rFonts w:ascii="David" w:cs="David" w:eastAsia="David" w:hAnsi="David"/>
+          <w:b w:val="false"/>
+          <w:bCs w:val="false"/>
+          <w:i w:val="false"/>
+          <w:iCs w:val="false"/>
+          <w:sz w:val="22"/>
+          <w:szCs w:val="22"/>
+          <w:rtl/>
+        </w:rPr>
+        <w:t xml:space="preserve">מנגנון זה יוצר תמרוץ כפול: לבעלות המעון - אינטרס ברור לזרז ולאפשר את קיום הבקרה בפועל; ולמשרד החינוך - אינטרס לבצע את הבקרות במועד, שכן איחור ייצור לחץ ישיר מצד הבעלויות. במקביל, המנגנון מייתר את הצורך בהליך קיזוז רטרואקטיבי מורכב במקרים שבהם הבקרה וההליך הנלווה לה מתמשכים - שכן במקום לשלם ולתקן בדיעבד, התשלום פשוט אינו יוצא עד שהסטטוס מאומת.</w:t>
       </w:r>
     </w:p>
     <w:p>
@@ -539,7 +540,125 @@
           <w:u w:val="single"/>
           <w:rtl/>
         </w:rPr>
-        <w:t xml:space="preserve">3.5 אחריות על השיח והתקשורת מול הגופים המפוקחים</w:t>
+        <w:t xml:space="preserve">3.4 המשך תשלום למעון עם סטטוס מאושר ממחזור קודם ("גלגול")</w:t>
+      </w:r>
+    </w:p>
+    <w:p>
+      <w:pPr>
+        <w:bidi/>
+        <w:spacing w:after="160" w:line="300"/>
+        <w:jc w:val="right"/>
+      </w:pPr>
+      <w:r>
+        <w:rPr>
+          <w:rFonts w:ascii="David" w:cs="David" w:eastAsia="David" w:hAnsi="David"/>
+          <w:b w:val="false"/>
+          <w:bCs w:val="false"/>
+          <w:i w:val="false"/>
+          <w:iCs w:val="false"/>
+          <w:sz w:val="22"/>
+          <w:szCs w:val="22"/>
+          <w:rtl/>
+        </w:rPr>
+        <w:t xml:space="preserve">על אף האמור בסעיף 3.3, לגבי מעון שלגביו קיימת בקרה שהושלמה ואושרה סופית במחזור קודם (לרבות מיצוי הליך שימוע, ככל שהיה) וללא ממצא או הליך פתוח שטרם הוכרע - ימשיך התשלום ברכיב המוגדל להשתלם על בסיס הסטטוס המאושר, גם בטרם הושלמה הבקרה השוטפת לשנה הנוכחית.</w:t>
+      </w:r>
+    </w:p>
+    <w:p>
+      <w:pPr>
+        <w:bidi/>
+        <w:spacing w:after="160" w:line="300"/>
+        <w:jc w:val="right"/>
+      </w:pPr>
+      <w:r>
+        <w:rPr>
+          <w:rFonts w:ascii="David" w:cs="David" w:eastAsia="David" w:hAnsi="David"/>
+          <w:b w:val="false"/>
+          <w:bCs w:val="false"/>
+          <w:i w:val="false"/>
+          <w:iCs w:val="false"/>
+          <w:sz w:val="22"/>
+          <w:szCs w:val="22"/>
+          <w:rtl/>
+        </w:rPr>
+        <w:t xml:space="preserve">לצורך כך, יעביר משרד החינוך למשרד העבודה מראש, לפני תחילת כל שנת תקציב, הצהרה מרוכזת הכוללת את רשימת המעונות העונים על התנאים האמורים, כך שלא יידרש אישור פרטני חוזר לכל מעון בנפרד.</w:t>
+      </w:r>
+    </w:p>
+    <w:p>
+      <w:pPr>
+        <w:bidi/>
+        <w:spacing w:after="160" w:line="300"/>
+        <w:jc w:val="right"/>
+      </w:pPr>
+      <w:r>
+        <w:rPr>
+          <w:rFonts w:ascii="David" w:cs="David" w:eastAsia="David" w:hAnsi="David"/>
+          <w:b w:val="false"/>
+          <w:bCs w:val="false"/>
+          <w:i w:val="false"/>
+          <w:iCs w:val="false"/>
+          <w:sz w:val="22"/>
+          <w:szCs w:val="22"/>
+          <w:rtl/>
+        </w:rPr>
+        <w:t xml:space="preserve">מעון חדש, מעון שמעולם לא הושלמה לגביו בקרה, או מעון שקיים לגביו ממצא/הליך פתוח מהמחזור הקודם - אינו נכלל בהצהרה, וחל לגביו סעיף 3.3 לעיל. ככל שבקרה שוטפת במעון "מגולגל" תעלה ממצא חדש - יחול לגביו ההליך שבסעיף 3.2, לרבות קיזוז רטרואקטיבי ככל שיידרש.</w:t>
+      </w:r>
+    </w:p>
+    <w:p>
+      <w:pPr>
+        <w:bidi/>
+        <w:spacing w:after="100" w:before="160"/>
+        <w:jc w:val="right"/>
+      </w:pPr>
+      <w:r>
+        <w:rPr>
+          <w:rFonts w:ascii="David" w:cs="David" w:eastAsia="David" w:hAnsi="David"/>
+          <w:b/>
+          <w:bCs/>
+          <w:sz w:val="22"/>
+          <w:szCs w:val="22"/>
+          <w:u w:val="single"/>
+          <w:rtl/>
+        </w:rPr>
+        <w:t xml:space="preserve">3.5 תשומות והיערכות מוקדמת של משרד העבודה</w:t>
+      </w:r>
+    </w:p>
+    <w:p>
+      <w:pPr>
+        <w:bidi/>
+        <w:spacing w:after="160" w:line="300"/>
+        <w:jc w:val="right"/>
+      </w:pPr>
+      <w:r>
+        <w:rPr>
+          <w:rFonts w:ascii="David" w:cs="David" w:eastAsia="David" w:hAnsi="David"/>
+          <w:b w:val="false"/>
+          <w:bCs w:val="false"/>
+          <w:i w:val="false"/>
+          <w:iCs w:val="false"/>
+          <w:sz w:val="22"/>
+          <w:szCs w:val="22"/>
+          <w:rtl/>
+        </w:rPr>
+        <w:t xml:space="preserve">משרד החינוך יביא בחשבון את צורכי ההיערכות של משרד העבודה כגוף המשלם, ויפעל להעברת הנתונים והתשומות הנדרשות בפרק זמן שיאפשר למשרד העבודה לבצע את ההתאמות התקציביות בזמן, כך שלא יישאר תקציב "באוויר" ללא החלטה עד תום שנת התקציב.</w:t>
+      </w:r>
+    </w:p>
+    <w:p>
+      <w:pPr>
+        <w:bidi/>
+        <w:spacing w:after="100" w:before="160"/>
+        <w:jc w:val="right"/>
+      </w:pPr>
+      <w:r>
+        <w:rPr>
+          <w:rFonts w:ascii="David" w:cs="David" w:eastAsia="David" w:hAnsi="David"/>
+          <w:b/>
+          <w:bCs/>
+          <w:sz w:val="22"/>
+          <w:szCs w:val="22"/>
+          <w:u w:val="single"/>
+          <w:rtl/>
+        </w:rPr>
+        <w:t xml:space="preserve">3.6 אחריות על השיח והתקשורת מול הגופים המפוקחים</w:t>
       </w:r>
     </w:p>
     <w:p>
@@ -1337,7 +1456,7 @@
                 <w:szCs w:val="20"/>
                 <w:rtl/>
               </w:rPr>
-              <w:t xml:space="preserve">עדכון שנתי מקדים על היעדר שינוי (למעונות ללא ממצא)</w:t>
+              <w:t xml:space="preserve">הצהרה מרוכזת על מעונות "מגולגלים" (סטטוס מאושר ממחזור קודם, ללא ממצא פתוח)</w:t>
             </w:r>
           </w:p>
         </w:tc>
@@ -1393,7 +1512,7 @@
                 <w:szCs w:val="20"/>
                 <w:rtl/>
               </w:rPr>
-              <w:t xml:space="preserve">הצהרה מרוכזת: "אין שינוי"</w:t>
+              <w:t xml:space="preserve">רשימת מעונות להמשך תשלום ללא בקרה מחודשת</w:t>
             </w:r>
           </w:p>
         </w:tc>
@@ -1451,7 +1570,121 @@
                 <w:szCs w:val="20"/>
                 <w:rtl/>
               </w:rPr>
-              <w:t xml:space="preserve">קיזוז / התאמת תשלום בהתאם לממצאים הסופיים</w:t>
+              <w:t xml:space="preserve">עיכוב תשלום ברכיב המוגדל למעון ללא בקרה מאומתת</w:t>
+            </w:r>
+          </w:p>
+        </w:tc>
+        <w:tc>
+          <w:tcPr>
+            <w:tcW w:type="dxa" w:w="2600"/>
+            <w:tcMar>
+              <w:top w:type="dxa" w:w="100"/>
+              <w:left w:type="dxa" w:w="120"/>
+              <w:bottom w:type="dxa" w:w="100"/>
+              <w:right w:type="dxa" w:w="120"/>
+            </w:tcMar>
+          </w:tcPr>
+          <w:p>
+            <w:pPr>
+              <w:bidi/>
+              <w:jc w:val="right"/>
+            </w:pPr>
+            <w:r>
+              <w:rPr>
+                <w:rFonts w:ascii="David" w:cs="David" w:eastAsia="David" w:hAnsi="David"/>
+                <w:b w:val="false"/>
+                <w:bCs w:val="false"/>
+                <w:sz w:val="20"/>
+                <w:szCs w:val="20"/>
+                <w:rtl/>
+              </w:rPr>
+              <w:t xml:space="preserve">משרד העבודה (הכלכלה והתעשייה)</w:t>
+            </w:r>
+          </w:p>
+        </w:tc>
+        <w:tc>
+          <w:tcPr>
+            <w:tcW w:type="dxa" w:w="2600"/>
+            <w:tcMar>
+              <w:top w:type="dxa" w:w="100"/>
+              <w:left w:type="dxa" w:w="120"/>
+              <w:bottom w:type="dxa" w:w="100"/>
+              <w:right w:type="dxa" w:w="120"/>
+            </w:tcMar>
+          </w:tcPr>
+          <w:p>
+            <w:pPr>
+              <w:bidi/>
+              <w:jc w:val="right"/>
+            </w:pPr>
+            <w:r>
+              <w:rPr>
+                <w:rFonts w:ascii="David" w:cs="David" w:eastAsia="David" w:hAnsi="David"/>
+                <w:b w:val="false"/>
+                <w:bCs w:val="false"/>
+                <w:sz w:val="20"/>
+                <w:szCs w:val="20"/>
+                <w:rtl/>
+              </w:rPr>
+              <w:t xml:space="preserve">אי-תשלום הרכיב המוגדל עד להשלמת הבקרה</w:t>
+            </w:r>
+          </w:p>
+        </w:tc>
+        <w:tc>
+          <w:tcPr>
+            <w:tcW w:type="dxa" w:w="2600"/>
+            <w:tcMar>
+              <w:top w:type="dxa" w:w="100"/>
+              <w:left w:type="dxa" w:w="120"/>
+              <w:bottom w:type="dxa" w:w="100"/>
+              <w:right w:type="dxa" w:w="120"/>
+            </w:tcMar>
+          </w:tcPr>
+          <w:p>
+            <w:pPr>
+              <w:bidi/>
+              <w:jc w:val="right"/>
+            </w:pPr>
+            <w:r>
+              <w:rPr>
+                <w:rFonts w:ascii="David" w:cs="David" w:eastAsia="David" w:hAnsi="David"/>
+                <w:b w:val="false"/>
+                <w:bCs w:val="false"/>
+                <w:sz w:val="20"/>
+                <w:szCs w:val="20"/>
+                <w:rtl/>
+              </w:rPr>
+              <w:t xml:space="preserve">מהמועד הקובע ואילך, עד השלמת הבקרה</w:t>
+            </w:r>
+          </w:p>
+        </w:tc>
+      </w:tr>
+      <w:tr>
+        <w:tc>
+          <w:tcPr>
+            <w:tcW w:type="dxa" w:w="2600"/>
+            <w:tcMar>
+              <w:top w:type="dxa" w:w="100"/>
+              <w:left w:type="dxa" w:w="120"/>
+              <w:bottom w:type="dxa" w:w="100"/>
+              <w:right w:type="dxa" w:w="120"/>
+            </w:tcMar>
+          </w:tcPr>
+          <w:p>
+            <w:pPr>
+              <w:bidi/>
+              <w:jc w:val="right"/>
+            </w:pPr>
+            <w:r>
+              <w:rPr>
+                <w:rFonts w:ascii="David" w:cs="David" w:eastAsia="David" w:hAnsi="David"/>
+                <w:b w:val="false"/>
+                <w:bCs w:val="false"/>
+                <w:sz w:val="20"/>
+                <w:szCs w:val="20"/>
+                <w:rtl/>
+              </w:rPr>
+              <w:t xml:space="preserve">קיזוז / התאמת תשלום בהתאם לממצאים הסופיים (למעונות מגולגלים בהם עלה ממצא)</w:t>
             </w:r>
           </w:p>
         </w:tc>
@@ -1597,7 +1830,7 @@
           <w:szCs w:val="22"/>
           <w:rtl/>
         </w:rPr>
-        <w:t xml:space="preserve">לקבוע מנגנון סנכרון מוסכם למצב בו דוחות סופיים מוגשים לפני/אחרי מועד השימוע, ואת המועד האחרון האפשרי לביצוע קיזוז מול סוף שנת התקציב.</w:t>
+        <w:t xml:space="preserve">לקבוע מול אגף מעונות (משרד העבודה) את "המועד הקובע" שממנו ואילך, אם לא הושלמה ואושרה בקרה למעון (לרבות מיצוי הליך שימוע ככל שנדרש) - יעוכב לגביו התשלום ברכיב המוגדל, בהתאם לעיקרון שנקבע בסעיף 3.3. במסגרת זו יש להכריע האם יחול חריג במקרה שבו העיכוב נובע במובהק מכשל תפעולי של משרד החינוך ולא מהתנהלות הבעלות (למשל בעלות שביקשה בקרה במפורש ולא זומנה), או שהכלל יחול באופן אחיד ללא תלות בסיבת העיכוב.</w:t>
       </w:r>
     </w:p>
     <w:p>

</xml_diff>